<commit_message>
Update team credentials, roll numbers, guide (Dr. Nitika Nigam), and department (Information Technology)
</commit_message>
<xml_diff>
--- a/report/Minor_Project_Report.docx
+++ b/report/Minor_Project_Report.docx
@@ -30,7 +30,7 @@
           <w:iCs/>
           <w:i/>
         </w:rPr>
-        <w:t xml:space="preserve">Submitted in partial fulfillment of the requirements for the Degree of Bachelor of Technology in Computer Science and Engineering</w:t>
+        <w:t xml:space="preserve">Submitted in partial fulfillment of the requirements for the Degree of Bachelor of Technology in Information Technology</w:t>
       </w:r>
     </w:p>
     <w:p>
@@ -72,7 +72,7 @@
         <w:t xml:space="preserve"> </w:t>
       </w:r>
       <w:r>
-        <w:t xml:space="preserve">(Team Lead) —</w:t>
+        <w:t xml:space="preserve">—</w:t>
       </w:r>
       <w:r>
         <w:t xml:space="preserve"> </w:t>
@@ -82,7 +82,7 @@
           <w:iCs/>
           <w:i/>
         </w:rPr>
-        <w:t xml:space="preserve">Roll No. / Enrollment No.</w:t>
+        <w:t xml:space="preserve">Roll No. 24124085</w:t>
       </w:r>
     </w:p>
     <w:p>
@@ -98,7 +98,7 @@
           <w:bCs/>
           <w:b/>
         </w:rPr>
-        <w:t xml:space="preserve">[Teammate 2 Name]</w:t>
+        <w:t xml:space="preserve">Ayush Bansal</w:t>
       </w:r>
       <w:r>
         <w:t xml:space="preserve"> </w:t>
@@ -114,7 +114,7 @@
           <w:iCs/>
           <w:i/>
         </w:rPr>
-        <w:t xml:space="preserve">Roll No. / Enrollment No.</w:t>
+        <w:t xml:space="preserve">Roll No. 24124025</w:t>
       </w:r>
     </w:p>
     <w:p>
@@ -130,7 +130,7 @@
           <w:bCs/>
           <w:b/>
         </w:rPr>
-        <w:t xml:space="preserve">[Teammate 3 Name]</w:t>
+        <w:t xml:space="preserve">Abhay Kaushal</w:t>
       </w:r>
       <w:r>
         <w:t xml:space="preserve"> </w:t>
@@ -146,7 +146,7 @@
           <w:iCs/>
           <w:i/>
         </w:rPr>
-        <w:t xml:space="preserve">Roll No. / Enrollment No.</w:t>
+        <w:t xml:space="preserve">Roll No. 24124003</w:t>
       </w:r>
     </w:p>
     <w:p>
@@ -164,7 +164,7 @@
         <w:t xml:space="preserve"> </w:t>
       </w:r>
       <w:r>
-        <w:t xml:space="preserve">Prof. [Supervisor Name], Department of Computer Science &amp; Engineering</w:t>
+        <w:t xml:space="preserve">Dr. Nitika Nigam, Department of Information Technology</w:t>
       </w:r>
       <w:r>
         <w:br/>

</xml_diff>